<commit_message>
Created space for chapter 6
</commit_message>
<xml_diff>
--- a/assignments/FIN-220-F25-HW5_Savage.docx
+++ b/assignments/FIN-220-F25-HW5_Savage.docx
@@ -739,6 +739,9 @@
         <w:ind w:left="299" w:firstLine="0"/>
       </w:pPr>
       <w:r>
+        <w:rPr>
+          <w:noProof/>
+        </w:rPr>
         <w:drawing>
           <wp:inline distT="0" distB="0" distL="0" distR="0" wp14:anchorId="1955C924" wp14:editId="61DE9240">
             <wp:extent cx="9525" cy="9525"/>
@@ -1087,7 +1090,7 @@
           </mc:Choice>
           <mc:Fallback>
             <w:pict>
-              <v:shapetype w14:anchorId="2377028D" id="_x0000_t13" coordsize="21600,21600" o:spt="13" adj="16200,5400" path="m@0,l@0@1,0@1,0@2@0@2@0,21600,21600,10800xe">
+              <v:shapetype w14:anchorId="6A21E558" id="_x0000_t13" coordsize="21600,21600" o:spt="13" adj="16200,5400" path="m@0,l@0@1,0@1,0@2@0@2@0,21600,21600,10800xe">
                 <v:stroke joinstyle="miter"/>
                 <v:formulas>
                   <v:f eqn="val #0"/>
@@ -1111,6 +1114,9 @@
         </mc:AlternateContent>
       </w:r>
       <w:r>
+        <w:rPr>
+          <w:noProof/>
+        </w:rPr>
         <w:drawing>
           <wp:inline distT="0" distB="0" distL="0" distR="0" wp14:anchorId="7AC71410" wp14:editId="1EFD3F69">
             <wp:extent cx="5761990" cy="3800475"/>
@@ -2083,6 +2089,7 @@
   <w:style w:type="character" w:default="1" w:styleId="DefaultParagraphFont">
     <w:name w:val="Default Paragraph Font"/>
     <w:uiPriority w:val="1"/>
+    <w:semiHidden/>
     <w:unhideWhenUsed/>
   </w:style>
   <w:style w:type="table" w:default="1" w:styleId="TableNormal">

</xml_diff>